<commit_message>
docs(lgpd): dados institucionais reais da CDL Aracaju
- CNPJ corrigido pra 13.045.935/0001-36
- Endereço: Rua Santa Luzia, 570, São José, Aracaju/SE — CEP 49015-190
- Telefone institucional (79) 3212-7700
- Presidente (Elison Vieira Santos do Bomfim) e 1ª Secretária
  (Claudimara Fontes Carvalho) preenchidos na ata
- Vice-Presidente (Milton Cruz) como suplente do Coordenador CRI
- Diretor de Relações Institucionais (Victor Barreto) no CRI Jurídico
- Histórico institucional consolidado: fundação 21/12/1961, Lei
  Municipal nº 63 de 6/12/1967, com referência à fonte primária
  (livro Os 50 Anos do CDL, p. 84) no RIPD e lgpd.md

Co-Authored-By: Claude Opus 4.7 (1M context) <noreply@anthropic.com>
</commit_message>
<xml_diff>
--- a/docs/ata-dpo.docx
+++ b/docs/ata-dpo.docx
@@ -35,7 +35,7 @@
           <w:sz w:val="24"/>
           <w:szCs w:val="24"/>
         </w:rPr>
-        <w:t xml:space="preserve">CNPJ 13.018.260/0001-90</w:t>
+        <w:t xml:space="preserve">Associação civil sem fins lucrativos · Fundada em 21 de dezembro de 1961</w:t>
       </w:r>
     </w:p>
     <w:p>
@@ -53,7 +53,43 @@
           <w:sz w:val="24"/>
           <w:szCs w:val="24"/>
         </w:rPr>
-        <w:t xml:space="preserve">Rua Itabaiana, 47, Centro, Aracaju/SE</w:t>
+        <w:t xml:space="preserve">Entidade de utilidade pública — Lei Municipal nº 63 de 6 de dezembro de 1967</w:t>
+      </w:r>
+    </w:p>
+    <w:p>
+      <w:pPr>
+        <w:spacing w:after="80" w:before="80" w:line="320"/>
+        <w:jc w:val="center"/>
+      </w:pPr>
+      <w:r>
+        <w:rPr>
+          <w:rFonts w:ascii="Times New Roman" w:cs="Times New Roman" w:eastAsia="Times New Roman" w:hAnsi="Times New Roman"/>
+          <w:b w:val="false"/>
+          <w:bCs w:val="false"/>
+          <w:i w:val="false"/>
+          <w:iCs w:val="false"/>
+          <w:sz w:val="24"/>
+          <w:szCs w:val="24"/>
+        </w:rPr>
+        <w:t xml:space="preserve">CNPJ 13.045.935/0001-36</w:t>
+      </w:r>
+    </w:p>
+    <w:p>
+      <w:pPr>
+        <w:spacing w:after="80" w:before="80" w:line="320"/>
+        <w:jc w:val="center"/>
+      </w:pPr>
+      <w:r>
+        <w:rPr>
+          <w:rFonts w:ascii="Times New Roman" w:cs="Times New Roman" w:eastAsia="Times New Roman" w:hAnsi="Times New Roman"/>
+          <w:b w:val="false"/>
+          <w:bCs w:val="false"/>
+          <w:i w:val="false"/>
+          <w:iCs w:val="false"/>
+          <w:sz w:val="24"/>
+          <w:szCs w:val="24"/>
+        </w:rPr>
+        <w:t xml:space="preserve">Rua Santa Luzia, 570, São José, Aracaju/SE — CEP 49015-190</w:t>
       </w:r>
     </w:p>
     <w:p>
@@ -225,7 +261,7 @@
           <w:sz w:val="24"/>
           <w:szCs w:val="24"/>
         </w:rPr>
-        <w:t xml:space="preserve">Sede da CDL Aracaju · Rua Itabaiana, 47, Centro, Aracaju/SE.</w:t>
+        <w:t xml:space="preserve">Sede da CDL Aracaju · Rua Santa Luzia, 570, São José, Aracaju/SE — CEP 49015-190.</w:t>
       </w:r>
     </w:p>
     <w:p>
@@ -255,7 +291,7 @@
           <w:sz w:val="24"/>
           <w:szCs w:val="24"/>
         </w:rPr>
-        <w:t xml:space="preserve">________________________________________________________</w:t>
+        <w:t xml:space="preserve">Elison Vieira Santos do Bomfim — Presidente da CDL Aracaju (triênio 2026–2028).</w:t>
       </w:r>
     </w:p>
     <w:p>
@@ -285,7 +321,7 @@
           <w:sz w:val="24"/>
           <w:szCs w:val="24"/>
         </w:rPr>
-        <w:t xml:space="preserve">________________________________________________________</w:t>
+        <w:t xml:space="preserve">Claudimara Fontes Carvalho — 1ª Secretária da Diretoria.</w:t>
       </w:r>
     </w:p>
     <w:p>
@@ -861,19 +897,19 @@
           <w:sz w:val="24"/>
           <w:szCs w:val="24"/>
         </w:rPr>
-        <w:t xml:space="preserve">• Telefone / WhatsApp institucional: </w:t>
-      </w:r>
-      <w:r>
-        <w:rPr>
-          <w:rFonts w:ascii="Times New Roman" w:cs="Times New Roman" w:eastAsia="Times New Roman" w:hAnsi="Times New Roman"/>
-          <w:b w:val="false"/>
-          <w:bCs w:val="false"/>
-          <w:i w:val="false"/>
-          <w:iCs w:val="false"/>
-          <w:sz w:val="24"/>
-          <w:szCs w:val="24"/>
-        </w:rPr>
-        <w:t xml:space="preserve">(79) _____-_____</w:t>
+        <w:t xml:space="preserve">• Telefone institucional: </w:t>
+      </w:r>
+      <w:r>
+        <w:rPr>
+          <w:rFonts w:ascii="Times New Roman" w:cs="Times New Roman" w:eastAsia="Times New Roman" w:hAnsi="Times New Roman"/>
+          <w:b w:val="false"/>
+          <w:bCs w:val="false"/>
+          <w:i w:val="false"/>
+          <w:iCs w:val="false"/>
+          <w:sz w:val="24"/>
+          <w:szCs w:val="24"/>
+        </w:rPr>
+        <w:t xml:space="preserve">(79) 3212-7700</w:t>
       </w:r>
     </w:p>
     <w:p>
@@ -903,7 +939,7 @@
           <w:sz w:val="24"/>
           <w:szCs w:val="24"/>
         </w:rPr>
-        <w:t xml:space="preserve">Rua Itabaiana, 47, Centro, Aracaju/SE — CEP 49010-______</w:t>
+        <w:t xml:space="preserve">Rua Santa Luzia, 570, São José, Aracaju/SE — CEP 49015-190</w:t>
       </w:r>
     </w:p>
     <w:p>
@@ -1665,7 +1701,7 @@
           <w:sz w:val="24"/>
           <w:szCs w:val="24"/>
         </w:rPr>
-        <w:t xml:space="preserve">[NOME COMPLETO DO PRESIDENTE]</w:t>
+        <w:t xml:space="preserve">ELISON VIEIRA SANTOS DO BOMFIM</w:t>
       </w:r>
     </w:p>
     <w:p>
@@ -1683,7 +1719,7 @@
           <w:sz w:val="24"/>
           <w:szCs w:val="24"/>
         </w:rPr>
-        <w:t xml:space="preserve">Presidente da CDL Aracaju</w:t>
+        <w:t xml:space="preserve">Presidente da CDL Aracaju (triênio 2026–2028)</w:t>
       </w:r>
     </w:p>
     <w:p>
@@ -1789,7 +1825,7 @@
           <w:sz w:val="24"/>
           <w:szCs w:val="24"/>
         </w:rPr>
-        <w:t xml:space="preserve">[NOME COMPLETO DO(A) SECRETÁRIO(A) AD HOC]</w:t>
+        <w:t xml:space="preserve">CLAUDIMARA FONTES CARVALHO</w:t>
       </w:r>
     </w:p>
     <w:p>
@@ -1807,7 +1843,7 @@
           <w:sz w:val="24"/>
           <w:szCs w:val="24"/>
         </w:rPr>
-        <w:t xml:space="preserve">Secretário(a) ad hoc</w:t>
+        <w:t xml:space="preserve">1ª Secretária da Diretoria · Secretária ad hoc desta reunião</w:t>
       </w:r>
     </w:p>
     <w:p>

</xml_diff>